<commit_message>
app.py, logo e relatório
</commit_message>
<xml_diff>
--- a/Relatório Grupo N.docx
+++ b/Relatório Grupo N.docx
@@ -50,16 +50,12 @@
           <w:szCs w:val="92"/>
           <w:rtl w:val="0"/>
         </w:rPr>
-        <w:t xml:space="preserve">NOME</w:t>
-      </w:r>
-      <w:r>
-        <w:rPr>
-          <w:rFonts w:ascii="Inter" w:cs="Inter" w:eastAsia="Inter" w:hAnsi="Inter"/>
-          <w:sz w:val="92"/>
-          <w:szCs w:val="92"/>
-          <w:rtl w:val="0"/>
-        </w:rPr>
-        <w:t xml:space="preserve"> DA SOLUÇÃO</w:t>
+        <w:t xml:space="preserve">NOVAROTA</w:t>
+      </w:r>
+      <w:r>
+        <w:rPr>
+          <w:rtl w:val="0"/>
+        </w:rPr>
       </w:r>
     </w:p>
     <w:p>
@@ -71,7 +67,7 @@
         <w:rPr>
           <w:rtl w:val="0"/>
         </w:rPr>
-        <w:t xml:space="preserve">Nome do Grupo</w:t>
+        <w:t xml:space="preserve">Grupo N</w:t>
       </w:r>
     </w:p>
     <w:p>
@@ -1381,12 +1377,12 @@
           <wp:inline distB="114300" distT="114300" distL="114300" distR="114300">
             <wp:extent cx="6496050" cy="3659772"/>
             <wp:effectExtent b="0" l="0" r="0" t="0"/>
-            <wp:docPr id="5" name="image1.png"/>
+            <wp:docPr id="5" name="image3.png"/>
             <a:graphic>
               <a:graphicData uri="http://schemas.openxmlformats.org/drawingml/2006/picture">
                 <pic:pic>
                   <pic:nvPicPr>
-                    <pic:cNvPr id="0" name="image1.png"/>
+                    <pic:cNvPr id="0" name="image3.png"/>
                     <pic:cNvPicPr preferRelativeResize="0"/>
                   </pic:nvPicPr>
                   <pic:blipFill>
@@ -2923,12 +2919,12 @@
                 <wp:inline distB="114300" distT="114300" distL="114300" distR="114300">
                   <wp:extent cx="4169863" cy="3322745"/>
                   <wp:effectExtent b="0" l="0" r="0" t="0"/>
-                  <wp:docPr id="1" name="image4.png"/>
+                  <wp:docPr id="1" name="image1.png"/>
                   <a:graphic>
                     <a:graphicData uri="http://schemas.openxmlformats.org/drawingml/2006/picture">
                       <pic:pic>
                         <pic:nvPicPr>
-                          <pic:cNvPr id="0" name="image4.png"/>
+                          <pic:cNvPr id="0" name="image1.png"/>
                           <pic:cNvPicPr preferRelativeResize="0"/>
                         </pic:nvPicPr>
                         <pic:blipFill>
@@ -3000,12 +2996,12 @@
                 <wp:inline distB="114300" distT="114300" distL="114300" distR="114300">
                   <wp:extent cx="11325225" cy="4667250"/>
                   <wp:effectExtent b="0" l="0" r="0" t="0"/>
-                  <wp:docPr id="4" name="image3.png"/>
+                  <wp:docPr id="4" name="image4.png"/>
                   <a:graphic>
                     <a:graphicData uri="http://schemas.openxmlformats.org/drawingml/2006/picture">
                       <pic:pic>
                         <pic:nvPicPr>
-                          <pic:cNvPr id="0" name="image3.png"/>
+                          <pic:cNvPr id="0" name="image4.png"/>
                           <pic:cNvPicPr preferRelativeResize="0"/>
                         </pic:nvPicPr>
                         <pic:blipFill>
@@ -3057,21 +3053,6 @@
     </w:p>
     <w:p>
       <w:pPr>
-        <w:spacing w:after="140" w:lineRule="auto"/>
-        <w:ind w:firstLine="720"/>
-        <w:jc w:val="left"/>
-        <w:rPr>
-          <w:rFonts w:ascii="Inter Light" w:cs="Inter Light" w:eastAsia="Inter Light" w:hAnsi="Inter Light"/>
-        </w:rPr>
-      </w:pPr>
-      <w:r>
-        <w:rPr>
-          <w:rtl w:val="0"/>
-        </w:rPr>
-      </w:r>
-    </w:p>
-    <w:p>
-      <w:pPr>
         <w:pStyle w:val="Heading2"/>
         <w:keepNext w:val="0"/>
         <w:keepLines w:val="0"/>
@@ -3086,7 +3067,7 @@
           <w:szCs w:val="51"/>
         </w:rPr>
       </w:pPr>
-      <w:bookmarkStart w:colFirst="0" w:colLast="0" w:name="_gk5w8vjpuym5" w:id="10"/>
+      <w:bookmarkStart w:colFirst="0" w:colLast="0" w:name="_61f52i5vzvdr" w:id="10"/>
       <w:bookmarkEnd w:id="10"/>
       <w:r>
         <w:rPr>
@@ -3095,264 +3076,120 @@
           <w:szCs w:val="51"/>
           <w:rtl w:val="0"/>
         </w:rPr>
-        <w:t xml:space="preserve">5. Conclusão</w:t>
-      </w:r>
-    </w:p>
-    <w:p>
-      <w:pPr>
-        <w:ind w:left="0" w:firstLine="0"/>
-        <w:rPr>
-          <w:rFonts w:ascii="Inter" w:cs="Inter" w:eastAsia="Inter" w:hAnsi="Inter"/>
-          <w:b w:val="1"/>
-          <w:bCs w:val="1"/>
-          <w:sz w:val="21"/>
-          <w:szCs w:val="21"/>
-        </w:rPr>
-      </w:pPr>
-      <w:r>
-        <w:rPr>
-          <w:rFonts w:ascii="Inter" w:cs="Inter" w:eastAsia="Inter" w:hAnsi="Inter"/>
-          <w:b w:val="1"/>
-          <w:bCs w:val="1"/>
-          <w:sz w:val="21"/>
-          <w:szCs w:val="21"/>
-          <w:rtl w:val="0"/>
-        </w:rPr>
-        <w:t xml:space="preserve">Responsáveis pela seção:</w:t>
-      </w:r>
-    </w:p>
-    <w:p>
-      <w:pPr>
-        <w:numPr>
-          <w:ilvl w:val="0"/>
-          <w:numId w:val="13"/>
-        </w:numPr>
-        <w:spacing w:after="140" w:lineRule="auto"/>
-        <w:jc w:val="left"/>
-        <w:rPr>
-          <w:rFonts w:ascii="Inter" w:cs="Inter" w:eastAsia="Inter" w:hAnsi="Inter"/>
-          <w:color w:val="000000"/>
-        </w:rPr>
-      </w:pPr>
-      <w:r>
-        <w:rPr>
-          <w:rFonts w:ascii="Inter" w:cs="Inter" w:eastAsia="Inter" w:hAnsi="Inter"/>
-          <w:sz w:val="21"/>
-          <w:szCs w:val="21"/>
-          <w:rtl w:val="0"/>
-        </w:rPr>
-        <w:t xml:space="preserve">Nome(s) do(s) integrante(s)</w:t>
-      </w:r>
-    </w:p>
-    <w:p>
-      <w:pPr>
-        <w:ind w:left="0" w:firstLine="0"/>
-        <w:rPr>
-          <w:rFonts w:ascii="Inter" w:cs="Inter" w:eastAsia="Inter" w:hAnsi="Inter"/>
-          <w:sz w:val="21"/>
-          <w:szCs w:val="21"/>
-        </w:rPr>
-      </w:pPr>
-      <w:r>
-        <w:rPr>
-          <w:rFonts w:ascii="Inter" w:cs="Inter" w:eastAsia="Inter" w:hAnsi="Inter"/>
-          <w:sz w:val="21"/>
-          <w:szCs w:val="21"/>
-          <w:rtl w:val="0"/>
-        </w:rPr>
-        <w:t xml:space="preserve">Apresentar:</w:t>
-      </w:r>
-    </w:p>
-    <w:p>
-      <w:pPr>
-        <w:numPr>
-          <w:ilvl w:val="0"/>
-          <w:numId w:val="10"/>
-        </w:numPr>
-        <w:spacing w:after="0" w:afterAutospacing="0" w:lineRule="auto"/>
-        <w:jc w:val="left"/>
-        <w:rPr>
-          <w:rFonts w:ascii="Inter" w:cs="Inter" w:eastAsia="Inter" w:hAnsi="Inter"/>
-          <w:color w:val="000000"/>
-        </w:rPr>
-      </w:pPr>
-      <w:r>
-        <w:rPr>
-          <w:rFonts w:ascii="Inter" w:cs="Inter" w:eastAsia="Inter" w:hAnsi="Inter"/>
-          <w:sz w:val="21"/>
-          <w:szCs w:val="21"/>
-          <w:rtl w:val="0"/>
-        </w:rPr>
-        <w:t xml:space="preserve">Principais resultados</w:t>
-      </w:r>
-    </w:p>
-    <w:p>
-      <w:pPr>
-        <w:numPr>
-          <w:ilvl w:val="0"/>
-          <w:numId w:val="10"/>
-        </w:numPr>
-        <w:spacing w:after="0" w:afterAutospacing="0" w:lineRule="auto"/>
-        <w:jc w:val="left"/>
-        <w:rPr>
-          <w:rFonts w:ascii="Inter" w:cs="Inter" w:eastAsia="Inter" w:hAnsi="Inter"/>
-          <w:color w:val="000000"/>
-        </w:rPr>
-      </w:pPr>
-      <w:r>
-        <w:rPr>
-          <w:rFonts w:ascii="Inter" w:cs="Inter" w:eastAsia="Inter" w:hAnsi="Inter"/>
-          <w:sz w:val="21"/>
-          <w:szCs w:val="21"/>
-          <w:rtl w:val="0"/>
-        </w:rPr>
-        <w:t xml:space="preserve">Insights obtidos</w:t>
-      </w:r>
-    </w:p>
-    <w:p>
-      <w:pPr>
-        <w:numPr>
-          <w:ilvl w:val="0"/>
-          <w:numId w:val="10"/>
-        </w:numPr>
-        <w:spacing w:after="0" w:afterAutospacing="0" w:lineRule="auto"/>
-        <w:jc w:val="left"/>
-        <w:rPr>
-          <w:rFonts w:ascii="Inter" w:cs="Inter" w:eastAsia="Inter" w:hAnsi="Inter"/>
-          <w:color w:val="000000"/>
-        </w:rPr>
-      </w:pPr>
-      <w:r>
-        <w:rPr>
-          <w:rFonts w:ascii="Inter" w:cs="Inter" w:eastAsia="Inter" w:hAnsi="Inter"/>
-          <w:sz w:val="21"/>
-          <w:szCs w:val="21"/>
-          <w:rtl w:val="0"/>
-        </w:rPr>
-        <w:t xml:space="preserve">Limitações</w:t>
-      </w:r>
-    </w:p>
-    <w:p>
-      <w:pPr>
-        <w:numPr>
-          <w:ilvl w:val="0"/>
-          <w:numId w:val="10"/>
-        </w:numPr>
-        <w:spacing w:after="140" w:lineRule="auto"/>
-        <w:jc w:val="left"/>
-        <w:rPr>
-          <w:rFonts w:ascii="Inter" w:cs="Inter" w:eastAsia="Inter" w:hAnsi="Inter"/>
-          <w:color w:val="000000"/>
-        </w:rPr>
-      </w:pPr>
-      <w:r>
-        <w:rPr>
-          <w:rFonts w:ascii="Inter" w:cs="Inter" w:eastAsia="Inter" w:hAnsi="Inter"/>
-          <w:sz w:val="21"/>
-          <w:szCs w:val="21"/>
-          <w:rtl w:val="0"/>
-        </w:rPr>
-        <w:t xml:space="preserve">Melhorias futuras</w:t>
-      </w:r>
-    </w:p>
-    <w:p>
-      <w:pPr>
-        <w:ind w:left="0" w:firstLine="0"/>
-        <w:rPr>
-          <w:rFonts w:ascii="Inter" w:cs="Inter" w:eastAsia="Inter" w:hAnsi="Inter"/>
-          <w:sz w:val="21"/>
-          <w:szCs w:val="21"/>
-        </w:rPr>
-      </w:pPr>
-      <w:r>
-        <w:rPr>
-          <w:rFonts w:ascii="Inter" w:cs="Inter" w:eastAsia="Inter" w:hAnsi="Inter"/>
-          <w:b w:val="1"/>
-          <w:bCs w:val="1"/>
-          <w:sz w:val="21"/>
-          <w:szCs w:val="21"/>
-          <w:rtl w:val="0"/>
-        </w:rPr>
-        <w:t xml:space="preserve">Figura 5 — Síntese dos resultados</w:t>
-      </w:r>
-      <w:r>
-        <w:rPr>
-          <w:rFonts w:ascii="Inter" w:cs="Inter" w:eastAsia="Inter" w:hAnsi="Inter"/>
-          <w:sz w:val="21"/>
-          <w:szCs w:val="21"/>
-          <w:rtl w:val="0"/>
-        </w:rPr>
-        <w:t xml:space="preserve"> Inserir um gráfico final que resuma:</w:t>
-      </w:r>
-    </w:p>
-    <w:p>
-      <w:pPr>
-        <w:numPr>
-          <w:ilvl w:val="0"/>
-          <w:numId w:val="1"/>
-        </w:numPr>
-        <w:spacing w:after="0" w:afterAutospacing="0" w:lineRule="auto"/>
-        <w:jc w:val="left"/>
-        <w:rPr>
-          <w:rFonts w:ascii="Inter" w:cs="Inter" w:eastAsia="Inter" w:hAnsi="Inter"/>
-          <w:color w:val="000000"/>
-        </w:rPr>
-      </w:pPr>
-      <w:r>
-        <w:rPr>
-          <w:rFonts w:ascii="Inter" w:cs="Inter" w:eastAsia="Inter" w:hAnsi="Inter"/>
-          <w:sz w:val="21"/>
-          <w:szCs w:val="21"/>
-          <w:rtl w:val="0"/>
-        </w:rPr>
-        <w:t xml:space="preserve">desempenho geral</w:t>
-      </w:r>
-    </w:p>
-    <w:p>
-      <w:pPr>
-        <w:numPr>
-          <w:ilvl w:val="0"/>
-          <w:numId w:val="1"/>
-        </w:numPr>
-        <w:spacing w:after="0" w:afterAutospacing="0" w:lineRule="auto"/>
-        <w:jc w:val="left"/>
-        <w:rPr>
-          <w:rFonts w:ascii="Inter" w:cs="Inter" w:eastAsia="Inter" w:hAnsi="Inter"/>
-          <w:color w:val="000000"/>
-        </w:rPr>
-      </w:pPr>
-      <w:r>
-        <w:rPr>
-          <w:rFonts w:ascii="Inter" w:cs="Inter" w:eastAsia="Inter" w:hAnsi="Inter"/>
-          <w:sz w:val="21"/>
-          <w:szCs w:val="21"/>
-          <w:rtl w:val="0"/>
-        </w:rPr>
-        <w:t xml:space="preserve">comparação antes/depois</w:t>
-      </w:r>
-    </w:p>
-    <w:p>
-      <w:pPr>
-        <w:numPr>
-          <w:ilvl w:val="0"/>
-          <w:numId w:val="1"/>
-        </w:numPr>
-        <w:spacing w:after="140" w:lineRule="auto"/>
-        <w:jc w:val="left"/>
-        <w:rPr>
-          <w:rFonts w:ascii="Inter" w:cs="Inter" w:eastAsia="Inter" w:hAnsi="Inter"/>
-          <w:color w:val="000000"/>
-        </w:rPr>
-      </w:pPr>
-      <w:r>
-        <w:rPr>
-          <w:rFonts w:ascii="Inter" w:cs="Inter" w:eastAsia="Inter" w:hAnsi="Inter"/>
-          <w:sz w:val="21"/>
-          <w:szCs w:val="21"/>
-          <w:rtl w:val="0"/>
-        </w:rPr>
-        <w:t xml:space="preserve">visualização do impacto da solução</w:t>
-      </w:r>
+        <w:t xml:space="preserve">5. Responsabilidades Individuais</w:t>
+      </w:r>
+    </w:p>
+    <w:p>
+      <w:pPr>
+        <w:keepNext w:val="0"/>
+        <w:keepLines w:val="0"/>
+        <w:pageBreakBefore w:val="0"/>
+        <w:widowControl w:val="1"/>
+        <w:pBdr>
+          <w:top w:space="0" w:sz="0" w:val="nil"/>
+          <w:left w:space="0" w:sz="0" w:val="nil"/>
+          <w:bottom w:space="0" w:sz="0" w:val="nil"/>
+          <w:right w:space="0" w:sz="0" w:val="nil"/>
+          <w:between w:space="0" w:sz="0" w:val="nil"/>
+        </w:pBdr>
+        <w:shd w:fill="auto" w:val="clear"/>
+        <w:spacing w:after="140" w:before="0" w:line="276" w:lineRule="auto"/>
+        <w:ind w:left="0" w:right="0" w:firstLine="0"/>
+        <w:jc w:val="left"/>
+        <w:rPr>
+          <w:rFonts w:ascii="Inter" w:cs="Inter" w:eastAsia="Inter" w:hAnsi="Inter"/>
+          <w:sz w:val="21"/>
+          <w:szCs w:val="21"/>
+        </w:rPr>
+      </w:pPr>
+      <w:r>
+        <w:rPr>
+          <w:rFonts w:ascii="Inter" w:cs="Inter" w:eastAsia="Inter" w:hAnsi="Inter"/>
+          <w:sz w:val="21"/>
+          <w:szCs w:val="21"/>
+          <w:rtl w:val="0"/>
+        </w:rPr>
+        <w:t xml:space="preserve">Felipe</w:t>
+      </w:r>
+      <w:r>
+        <w:rPr>
+          <w:rtl w:val="0"/>
+        </w:rPr>
+        <w:t xml:space="preserve"> </w:t>
+      </w:r>
+      <w:r>
+        <w:rPr>
+          <w:rFonts w:ascii="Inter" w:cs="Inter" w:eastAsia="Inter" w:hAnsi="Inter"/>
+          <w:sz w:val="21"/>
+          <w:szCs w:val="21"/>
+          <w:rtl w:val="0"/>
+        </w:rPr>
+        <w:t xml:space="preserve">Lemos: Responsável pela concepção inicial do problema e pela proposta de desenvolver uma solução com interface para o usuário final. Conduziu a análise geoespacial do projeto, incluindo a construção dos buffers espaciais, o cruzamento entre crimes e paradas e a associação entre paradas e linhas de ônibus. Realizou a agregação do dataset final por linha, consolidando as features de risco utilizadas na modelagem. Desenvolveu o modelo de clusterização K-Means, e contribuiu com a produção dos gráficos de análise e visualização dos resultados.</w:t>
+      </w:r>
+    </w:p>
+    <w:p>
+      <w:pPr>
+        <w:keepNext w:val="0"/>
+        <w:keepLines w:val="0"/>
+        <w:pageBreakBefore w:val="0"/>
+        <w:widowControl w:val="1"/>
+        <w:pBdr>
+          <w:top w:space="0" w:sz="0" w:val="nil"/>
+          <w:left w:space="0" w:sz="0" w:val="nil"/>
+          <w:bottom w:space="0" w:sz="0" w:val="nil"/>
+          <w:right w:space="0" w:sz="0" w:val="nil"/>
+          <w:between w:space="0" w:sz="0" w:val="nil"/>
+        </w:pBdr>
+        <w:shd w:fill="auto" w:val="clear"/>
+        <w:spacing w:after="140" w:before="0" w:line="276" w:lineRule="auto"/>
+        <w:ind w:left="0" w:right="0" w:firstLine="0"/>
+        <w:jc w:val="left"/>
+        <w:rPr>
+          <w:rFonts w:ascii="Inter" w:cs="Inter" w:eastAsia="Inter" w:hAnsi="Inter"/>
+          <w:sz w:val="21"/>
+          <w:szCs w:val="21"/>
+        </w:rPr>
+      </w:pPr>
+      <w:r>
+        <w:rPr>
+          <w:rtl w:val="0"/>
+        </w:rPr>
+      </w:r>
+    </w:p>
+    <w:p>
+      <w:pPr>
+        <w:keepNext w:val="0"/>
+        <w:keepLines w:val="0"/>
+        <w:pageBreakBefore w:val="0"/>
+        <w:widowControl w:val="1"/>
+        <w:pBdr>
+          <w:top w:space="0" w:sz="0" w:val="nil"/>
+          <w:left w:space="0" w:sz="0" w:val="nil"/>
+          <w:bottom w:space="0" w:sz="0" w:val="nil"/>
+          <w:right w:space="0" w:sz="0" w:val="nil"/>
+          <w:between w:space="0" w:sz="0" w:val="nil"/>
+        </w:pBdr>
+        <w:shd w:fill="auto" w:val="clear"/>
+        <w:spacing w:after="140" w:before="0" w:line="276" w:lineRule="auto"/>
+        <w:ind w:left="0" w:right="0" w:firstLine="0"/>
+        <w:jc w:val="left"/>
+        <w:rPr>
+          <w:rFonts w:ascii="Inter" w:cs="Inter" w:eastAsia="Inter" w:hAnsi="Inter"/>
+          <w:sz w:val="21"/>
+          <w:szCs w:val="21"/>
+        </w:rPr>
+      </w:pPr>
+      <w:r>
+        <w:rPr>
+          <w:rtl w:val="0"/>
+        </w:rPr>
+      </w:r>
+    </w:p>
+    <w:p>
+      <w:pPr>
+        <w:ind w:left="360" w:firstLine="0"/>
+        <w:rPr/>
+      </w:pPr>
       <w:r>
         <w:rPr>
           <w:rtl w:val="0"/>
@@ -3375,7 +3212,7 @@
           <w:szCs w:val="51"/>
         </w:rPr>
       </w:pPr>
-      <w:bookmarkStart w:colFirst="0" w:colLast="0" w:name="_b4w4ju1fwulq" w:id="11"/>
+      <w:bookmarkStart w:colFirst="0" w:colLast="0" w:name="_gk5w8vjpuym5" w:id="11"/>
       <w:bookmarkEnd w:id="11"/>
       <w:r>
         <w:rPr>
@@ -3384,7 +3221,314 @@
           <w:szCs w:val="51"/>
           <w:rtl w:val="0"/>
         </w:rPr>
-        <w:t xml:space="preserve">6. Referências</w:t>
+        <w:t xml:space="preserve">6</w:t>
+      </w:r>
+      <w:r>
+        <w:rPr>
+          <w:rFonts w:ascii="Inter" w:cs="Inter" w:eastAsia="Inter" w:hAnsi="Inter"/>
+          <w:sz w:val="51"/>
+          <w:szCs w:val="51"/>
+          <w:rtl w:val="0"/>
+        </w:rPr>
+        <w:t xml:space="preserve">. Conclusão</w:t>
+      </w:r>
+    </w:p>
+    <w:p>
+      <w:pPr>
+        <w:ind w:left="0" w:firstLine="0"/>
+        <w:rPr>
+          <w:rFonts w:ascii="Inter" w:cs="Inter" w:eastAsia="Inter" w:hAnsi="Inter"/>
+          <w:b w:val="1"/>
+          <w:bCs w:val="1"/>
+          <w:sz w:val="21"/>
+          <w:szCs w:val="21"/>
+        </w:rPr>
+      </w:pPr>
+      <w:r>
+        <w:rPr>
+          <w:rFonts w:ascii="Inter" w:cs="Inter" w:eastAsia="Inter" w:hAnsi="Inter"/>
+          <w:b w:val="1"/>
+          <w:bCs w:val="1"/>
+          <w:sz w:val="21"/>
+          <w:szCs w:val="21"/>
+          <w:rtl w:val="0"/>
+        </w:rPr>
+        <w:t xml:space="preserve">Responsáveis pela seção:</w:t>
+      </w:r>
+    </w:p>
+    <w:p>
+      <w:pPr>
+        <w:numPr>
+          <w:ilvl w:val="0"/>
+          <w:numId w:val="13"/>
+        </w:numPr>
+        <w:spacing w:after="140" w:lineRule="auto"/>
+        <w:jc w:val="left"/>
+        <w:rPr>
+          <w:rFonts w:ascii="Inter" w:cs="Inter" w:eastAsia="Inter" w:hAnsi="Inter"/>
+          <w:color w:val="000000"/>
+        </w:rPr>
+      </w:pPr>
+      <w:r>
+        <w:rPr>
+          <w:rFonts w:ascii="Inter" w:cs="Inter" w:eastAsia="Inter" w:hAnsi="Inter"/>
+          <w:sz w:val="21"/>
+          <w:szCs w:val="21"/>
+          <w:rtl w:val="0"/>
+        </w:rPr>
+        <w:t xml:space="preserve">Nome(s) do(s) integrante(s)</w:t>
+      </w:r>
+    </w:p>
+    <w:p>
+      <w:pPr>
+        <w:ind w:left="0" w:firstLine="0"/>
+        <w:rPr>
+          <w:rFonts w:ascii="Inter" w:cs="Inter" w:eastAsia="Inter" w:hAnsi="Inter"/>
+          <w:sz w:val="21"/>
+          <w:szCs w:val="21"/>
+        </w:rPr>
+      </w:pPr>
+      <w:r>
+        <w:rPr>
+          <w:rFonts w:ascii="Inter" w:cs="Inter" w:eastAsia="Inter" w:hAnsi="Inter"/>
+          <w:sz w:val="21"/>
+          <w:szCs w:val="21"/>
+          <w:rtl w:val="0"/>
+        </w:rPr>
+        <w:t xml:space="preserve">Apresentar:</w:t>
+      </w:r>
+    </w:p>
+    <w:p>
+      <w:pPr>
+        <w:numPr>
+          <w:ilvl w:val="0"/>
+          <w:numId w:val="10"/>
+        </w:numPr>
+        <w:spacing w:after="0" w:afterAutospacing="0" w:lineRule="auto"/>
+        <w:jc w:val="left"/>
+        <w:rPr>
+          <w:rFonts w:ascii="Inter" w:cs="Inter" w:eastAsia="Inter" w:hAnsi="Inter"/>
+          <w:color w:val="000000"/>
+        </w:rPr>
+      </w:pPr>
+      <w:r>
+        <w:rPr>
+          <w:rFonts w:ascii="Inter" w:cs="Inter" w:eastAsia="Inter" w:hAnsi="Inter"/>
+          <w:sz w:val="21"/>
+          <w:szCs w:val="21"/>
+          <w:rtl w:val="0"/>
+        </w:rPr>
+        <w:t xml:space="preserve">Principais resultados</w:t>
+      </w:r>
+    </w:p>
+    <w:p>
+      <w:pPr>
+        <w:numPr>
+          <w:ilvl w:val="0"/>
+          <w:numId w:val="10"/>
+        </w:numPr>
+        <w:spacing w:after="0" w:afterAutospacing="0" w:lineRule="auto"/>
+        <w:jc w:val="left"/>
+        <w:rPr>
+          <w:rFonts w:ascii="Inter" w:cs="Inter" w:eastAsia="Inter" w:hAnsi="Inter"/>
+          <w:color w:val="000000"/>
+        </w:rPr>
+      </w:pPr>
+      <w:r>
+        <w:rPr>
+          <w:rFonts w:ascii="Inter" w:cs="Inter" w:eastAsia="Inter" w:hAnsi="Inter"/>
+          <w:sz w:val="21"/>
+          <w:szCs w:val="21"/>
+          <w:rtl w:val="0"/>
+        </w:rPr>
+        <w:t xml:space="preserve">Insights obtidos</w:t>
+      </w:r>
+    </w:p>
+    <w:p>
+      <w:pPr>
+        <w:numPr>
+          <w:ilvl w:val="0"/>
+          <w:numId w:val="10"/>
+        </w:numPr>
+        <w:spacing w:after="0" w:afterAutospacing="0" w:lineRule="auto"/>
+        <w:jc w:val="left"/>
+        <w:rPr>
+          <w:rFonts w:ascii="Inter" w:cs="Inter" w:eastAsia="Inter" w:hAnsi="Inter"/>
+          <w:color w:val="000000"/>
+        </w:rPr>
+      </w:pPr>
+      <w:r>
+        <w:rPr>
+          <w:rFonts w:ascii="Inter" w:cs="Inter" w:eastAsia="Inter" w:hAnsi="Inter"/>
+          <w:sz w:val="21"/>
+          <w:szCs w:val="21"/>
+          <w:rtl w:val="0"/>
+        </w:rPr>
+        <w:t xml:space="preserve">Limitações</w:t>
+      </w:r>
+    </w:p>
+    <w:p>
+      <w:pPr>
+        <w:numPr>
+          <w:ilvl w:val="0"/>
+          <w:numId w:val="10"/>
+        </w:numPr>
+        <w:spacing w:after="140" w:lineRule="auto"/>
+        <w:jc w:val="left"/>
+        <w:rPr>
+          <w:rFonts w:ascii="Inter" w:cs="Inter" w:eastAsia="Inter" w:hAnsi="Inter"/>
+          <w:color w:val="000000"/>
+        </w:rPr>
+      </w:pPr>
+      <w:r>
+        <w:rPr>
+          <w:rFonts w:ascii="Inter" w:cs="Inter" w:eastAsia="Inter" w:hAnsi="Inter"/>
+          <w:sz w:val="21"/>
+          <w:szCs w:val="21"/>
+          <w:rtl w:val="0"/>
+        </w:rPr>
+        <w:t xml:space="preserve">Melhorias futuras</w:t>
+      </w:r>
+    </w:p>
+    <w:p>
+      <w:pPr>
+        <w:ind w:left="0" w:firstLine="0"/>
+        <w:rPr>
+          <w:rFonts w:ascii="Inter" w:cs="Inter" w:eastAsia="Inter" w:hAnsi="Inter"/>
+          <w:sz w:val="21"/>
+          <w:szCs w:val="21"/>
+        </w:rPr>
+      </w:pPr>
+      <w:r>
+        <w:rPr>
+          <w:rFonts w:ascii="Inter" w:cs="Inter" w:eastAsia="Inter" w:hAnsi="Inter"/>
+          <w:b w:val="1"/>
+          <w:bCs w:val="1"/>
+          <w:sz w:val="21"/>
+          <w:szCs w:val="21"/>
+          <w:rtl w:val="0"/>
+        </w:rPr>
+        <w:t xml:space="preserve">Figura 5 — Síntese dos resultados</w:t>
+      </w:r>
+      <w:r>
+        <w:rPr>
+          <w:rFonts w:ascii="Inter" w:cs="Inter" w:eastAsia="Inter" w:hAnsi="Inter"/>
+          <w:sz w:val="21"/>
+          <w:szCs w:val="21"/>
+          <w:rtl w:val="0"/>
+        </w:rPr>
+        <w:t xml:space="preserve"> Inserir um gráfico final que resuma:</w:t>
+      </w:r>
+    </w:p>
+    <w:p>
+      <w:pPr>
+        <w:numPr>
+          <w:ilvl w:val="0"/>
+          <w:numId w:val="1"/>
+        </w:numPr>
+        <w:spacing w:after="0" w:afterAutospacing="0" w:lineRule="auto"/>
+        <w:jc w:val="left"/>
+        <w:rPr>
+          <w:rFonts w:ascii="Inter" w:cs="Inter" w:eastAsia="Inter" w:hAnsi="Inter"/>
+          <w:color w:val="000000"/>
+        </w:rPr>
+      </w:pPr>
+      <w:r>
+        <w:rPr>
+          <w:rFonts w:ascii="Inter" w:cs="Inter" w:eastAsia="Inter" w:hAnsi="Inter"/>
+          <w:sz w:val="21"/>
+          <w:szCs w:val="21"/>
+          <w:rtl w:val="0"/>
+        </w:rPr>
+        <w:t xml:space="preserve">desempenho geral</w:t>
+      </w:r>
+    </w:p>
+    <w:p>
+      <w:pPr>
+        <w:numPr>
+          <w:ilvl w:val="0"/>
+          <w:numId w:val="1"/>
+        </w:numPr>
+        <w:spacing w:after="0" w:afterAutospacing="0" w:lineRule="auto"/>
+        <w:jc w:val="left"/>
+        <w:rPr>
+          <w:rFonts w:ascii="Inter" w:cs="Inter" w:eastAsia="Inter" w:hAnsi="Inter"/>
+          <w:color w:val="000000"/>
+        </w:rPr>
+      </w:pPr>
+      <w:r>
+        <w:rPr>
+          <w:rFonts w:ascii="Inter" w:cs="Inter" w:eastAsia="Inter" w:hAnsi="Inter"/>
+          <w:sz w:val="21"/>
+          <w:szCs w:val="21"/>
+          <w:rtl w:val="0"/>
+        </w:rPr>
+        <w:t xml:space="preserve">comparação antes/depois</w:t>
+      </w:r>
+    </w:p>
+    <w:p>
+      <w:pPr>
+        <w:numPr>
+          <w:ilvl w:val="0"/>
+          <w:numId w:val="1"/>
+        </w:numPr>
+        <w:spacing w:after="140" w:lineRule="auto"/>
+        <w:jc w:val="left"/>
+        <w:rPr>
+          <w:rFonts w:ascii="Inter" w:cs="Inter" w:eastAsia="Inter" w:hAnsi="Inter"/>
+          <w:color w:val="000000"/>
+        </w:rPr>
+      </w:pPr>
+      <w:r>
+        <w:rPr>
+          <w:rFonts w:ascii="Inter" w:cs="Inter" w:eastAsia="Inter" w:hAnsi="Inter"/>
+          <w:sz w:val="21"/>
+          <w:szCs w:val="21"/>
+          <w:rtl w:val="0"/>
+        </w:rPr>
+        <w:t xml:space="preserve">visualização do impacto da solução</w:t>
+      </w:r>
+      <w:r>
+        <w:rPr>
+          <w:rtl w:val="0"/>
+        </w:rPr>
+      </w:r>
+    </w:p>
+    <w:p>
+      <w:pPr>
+        <w:pStyle w:val="Heading2"/>
+        <w:keepNext w:val="0"/>
+        <w:keepLines w:val="0"/>
+        <w:pBdr>
+          <w:bottom w:color="auto" w:space="5" w:sz="0" w:val="none"/>
+        </w:pBdr>
+        <w:spacing w:after="240" w:line="300" w:lineRule="auto"/>
+        <w:ind w:firstLine="0"/>
+        <w:rPr>
+          <w:rFonts w:ascii="Inter" w:cs="Inter" w:eastAsia="Inter" w:hAnsi="Inter"/>
+          <w:sz w:val="51"/>
+          <w:szCs w:val="51"/>
+        </w:rPr>
+      </w:pPr>
+      <w:bookmarkStart w:colFirst="0" w:colLast="0" w:name="_b4w4ju1fwulq" w:id="12"/>
+      <w:bookmarkEnd w:id="12"/>
+      <w:r>
+        <w:rPr>
+          <w:rFonts w:ascii="Inter" w:cs="Inter" w:eastAsia="Inter" w:hAnsi="Inter"/>
+          <w:sz w:val="51"/>
+          <w:szCs w:val="51"/>
+          <w:rtl w:val="0"/>
+        </w:rPr>
+        <w:t xml:space="preserve">7</w:t>
+      </w:r>
+      <w:r>
+        <w:rPr>
+          <w:rFonts w:ascii="Inter" w:cs="Inter" w:eastAsia="Inter" w:hAnsi="Inter"/>
+          <w:sz w:val="51"/>
+          <w:szCs w:val="51"/>
+          <w:rtl w:val="0"/>
+        </w:rPr>
+        <w:t xml:space="preserve">. Referências</w:t>
       </w:r>
     </w:p>
     <w:p>

</xml_diff>